<commit_message>
Document the optional peer-benchmark capability end to end
The Databricks stage that closes the cross-client gap now has its
documentation, diagram and Word-guide section, matching what actually
ran on the deployed harness.

- docs/diagrams.md: diagram 9, how the crossing preserves isolation
- docs/guides/analyst.md: section 6, the four design decisions and the
  optionality contract; renumber the trailing section
- docs/aws-walkthrough.md: the optional step with real run output
- Word guide: Activity 5.2 with the rendered diagram, figures renumbered
- peer_benchmarks.py: pd.Timestamp.now("UTC"), the utcnow() form is
  deprecated

Co-Authored-By: Claude Opus 5 (1M context) <noreply@anthropic.com>
</commit_message>
<xml_diff>
--- a/docs/Intelligence-Engine-Operations-Guide.docx
+++ b/docs/Intelligence-Engine-Operations-Guide.docx
@@ -2838,6 +2838,182 @@
       </w:r>
     </w:p>
     <w:p>
+      <w:pPr>
+        <w:pStyle w:val="Heading2"/>
+      </w:pPr>
+      <w:r>
+        <w:t>Activity 5.2 - Peer benchmarks: the one thing only Databricks can do here</w:t>
+      </w:r>
+    </w:p>
+    <w:p>
+      <w:r>
+        <w:rPr>
+          <w:b w:val="0"/>
+          <w:i w:val="0"/>
+        </w:rPr>
+        <w:t>Every run is scoped to one client, and the cross_company_isolation guardrail enforces it. So a report can say “Clinical is 22% of headcount” but never “...against a 17% peer median” - the numbers that would answer that live in other clients' data. This is the gap Databricks is genuinely placed to close.</w:t>
+      </w:r>
+    </w:p>
+    <w:p>
+      <w:pPr>
+        <w:jc w:val="center"/>
+      </w:pPr>
+      <w:r>
+        <w:drawing>
+          <wp:inline xmlns:a="http://schemas.openxmlformats.org/drawingml/2006/main" xmlns:pic="http://schemas.openxmlformats.org/drawingml/2006/picture">
+            <wp:extent cx="5486400" cy="1371600"/>
+            <wp:docPr id="23" name="Picture 23"/>
+            <wp:cNvGraphicFramePr>
+              <a:graphicFrameLocks noChangeAspect="1"/>
+            </wp:cNvGraphicFramePr>
+            <a:graphic>
+              <a:graphicData uri="http://schemas.openxmlformats.org/drawingml/2006/picture">
+                <pic:pic>
+                  <pic:nvPicPr>
+                    <pic:cNvPr id="0" name="09-peer-benchmarks-crossing-clients-without-breaking-isolation.png"/>
+                    <pic:cNvPicPr/>
+                  </pic:nvPicPr>
+                  <pic:blipFill>
+                    <a:blip r:embed="rId31"/>
+                    <a:stretch>
+                      <a:fillRect/>
+                    </a:stretch>
+                  </pic:blipFill>
+                  <pic:spPr>
+                    <a:xfrm>
+                      <a:off x="0" y="0"/>
+                      <a:ext cx="5486400" cy="1371600"/>
+                    </a:xfrm>
+                    <a:prstGeom prst="rect"/>
+                  </pic:spPr>
+                </pic:pic>
+              </a:graphicData>
+            </a:graphic>
+          </wp:inline>
+        </w:drawing>
+      </w:r>
+    </w:p>
+    <w:p>
+      <w:pPr>
+        <w:jc w:val="center"/>
+      </w:pPr>
+      <w:r>
+        <w:rPr>
+          <w:i/>
+          <w:color w:val="5B677D"/>
+          <w:sz w:val="17"/>
+        </w:rPr>
+        <w:t>Figure 23. The crossing happens upstream of any run, and only a suppressed aggregate survives it. A run reads the product, never another client's rows, so the isolation guardrail still holds.</w:t>
+      </w:r>
+    </w:p>
+    <w:p>
+      <w:pPr>
+        <w:pStyle w:val="ListNumber"/>
+      </w:pPr>
+      <w:r>
+        <w:t>Four clients are taken through the medallion path, so there are peers to compare against.</w:t>
+      </w:r>
+    </w:p>
+    <w:p>
+      <w:pPr>
+        <w:pStyle w:val="ListNumber"/>
+      </w:pPr>
+      <w:r>
+        <w:t>A Unity Catalog view reads every client's governed L3 tier in place, read-only.</w:t>
+      </w:r>
+    </w:p>
+    <w:p>
+      <w:pPr>
+        <w:pStyle w:val="ListNumber"/>
+      </w:pPr>
+      <w:r>
+        <w:t>One SQL statement computes median share of workforce by seniority, suppressing any cell with fewer than three contributing clients.</w:t>
+      </w:r>
+    </w:p>
+    <w:p>
+      <w:pPr>
+        <w:pStyle w:val="ListNumber"/>
+      </w:pPr>
+      <w:r>
+        <w:t>The stage - not Databricks - writes the aggregate to derived/peer_benchmarks/ and registers it in Glue with full lineage.</w:t>
+      </w:r>
+    </w:p>
+    <w:p>
+      <w:pPr>
+        <w:pStyle w:val="ListNumber"/>
+      </w:pPr>
+      <w:r>
+        <w:t>A report run consumes the product. If Databricks is absent, the stage exits 0 and the report builds unchanged.</w:t>
+      </w:r>
+    </w:p>
+    <w:p>
+      <w:r>
+        <w:rPr>
+          <w:b/>
+          <w:i w:val="0"/>
+        </w:rPr>
+        <w:t>Executed on the deployed harness, four contributing clients:</w:t>
+      </w:r>
+    </w:p>
+    <w:p>
+      <w:pPr>
+        <w:ind w:left="360"/>
+      </w:pPr>
+      <w:r>
+        <w:rPr>
+          <w:rFonts w:ascii="Consolas" w:hAnsi="Consolas"/>
+          <w:sz w:val="17"/>
+        </w:rPr>
+        <w:t>OK | wrote s3://&lt;lakehouse&gt;/derived/peer_benchmarks/part-0000.parquet</w:t>
+        <w:br/>
+        <w:t xml:space="preserve">     (4734 bytes, 5 cells, up to 4 contributing clients)</w:t>
+        <w:br/>
+        <w:t>OK | created glue table ie_dev_derived.peer_benchmarks</w:t>
+        <w:br/>
+        <w:t>steward log: 1 event(s) -&gt; stewardship/gate-events/...</w:t>
+      </w:r>
+    </w:p>
+    <w:p>
+      <w:r>
+        <w:rPr>
+          <w:b/>
+          <w:i w:val="0"/>
+        </w:rPr>
+        <w:t>The product itself - a workforce pyramid with observed ranges:</w:t>
+      </w:r>
+    </w:p>
+    <w:p>
+      <w:pPr>
+        <w:ind w:left="360"/>
+      </w:pPr>
+      <w:r>
+        <w:rPr>
+          <w:rFonts w:ascii="Consolas" w:hAnsi="Consolas"/>
+          <w:sz w:val="17"/>
+        </w:rPr>
+        <w:t>seniority      clients  median share           range  median tenure</w:t>
+        <w:br/>
+        <w:t>Entry                4         41.9%      39.3-47.4%          1.14y</w:t>
+        <w:br/>
+        <w:t>Mid                  4         21.4%      19.5-21.9%          2.75y</w:t>
+        <w:br/>
+        <w:t>Senior               4         18.6%      13.6-23.0%          4.23y</w:t>
+        <w:br/>
+        <w:t>Director             4         12.2%       9.5-12.7%          5.61y</w:t>
+        <w:br/>
+        <w:t>VP/Executive         4          6.5%        5.0-6.8%          7.42y</w:t>
+      </w:r>
+    </w:p>
+    <w:p>
+      <w:r>
+        <w:rPr>
+          <w:b w:val="0"/>
+          <w:i/>
+        </w:rPr>
+        <w:t>Two design decisions are worth carrying into any similar work. Databricks holds no write path - it computes, the stage writes, and Glue stays the catalog of record, so provenance is never split across two catalogues. And the benchmark is keyed on seniority rather than department because the first run suppressed every cell: every seniority level is shared by all four clients, while the most widely shared department appears in only two. Department taxonomies are industry-specific, so a cross-industry department median compares things that are not alike. The suppression rule caught a modelling error before a human did.</w:t>
+      </w:r>
+    </w:p>
+    <w:p>
       <w:r>
         <w:br w:type="page"/>
       </w:r>
@@ -2964,7 +3140,7 @@
         <w:drawing>
           <wp:inline xmlns:a="http://schemas.openxmlformats.org/drawingml/2006/main" xmlns:pic="http://schemas.openxmlformats.org/drawingml/2006/picture">
             <wp:extent cx="5669280" cy="3634259"/>
-            <wp:docPr id="23" name="Picture 23"/>
+            <wp:docPr id="24" name="Picture 24"/>
             <wp:cNvGraphicFramePr>
               <a:graphicFrameLocks noChangeAspect="1"/>
             </wp:cNvGraphicFramePr>
@@ -2976,7 +3152,7 @@
                     <pic:cNvPicPr/>
                   </pic:nvPicPr>
                   <pic:blipFill>
-                    <a:blip r:embed="rId31"/>
+                    <a:blip r:embed="rId32"/>
                     <a:stretch>
                       <a:fillRect/>
                     </a:stretch>
@@ -3005,59 +3181,7 @@
           <w:color w:val="5B677D"/>
           <w:sz w:val="17"/>
         </w:rPr>
-        <w:t>Figure 23. The complete state machine. MidpointDecision and FinalDecision branch on the consultant's {decision, feedback}: revise counts a revision and re-runs the stages, reject ends the run, default carries on.</w:t>
-      </w:r>
-    </w:p>
-    <w:p>
-      <w:pPr>
-        <w:jc w:val="center"/>
-      </w:pPr>
-      <w:r>
-        <w:drawing>
-          <wp:inline xmlns:a="http://schemas.openxmlformats.org/drawingml/2006/main" xmlns:pic="http://schemas.openxmlformats.org/drawingml/2006/picture">
-            <wp:extent cx="5852160" cy="3375013"/>
-            <wp:docPr id="24" name="Picture 24"/>
-            <wp:cNvGraphicFramePr>
-              <a:graphicFrameLocks noChangeAspect="1"/>
-            </wp:cNvGraphicFramePr>
-            <a:graphic>
-              <a:graphicData uri="http://schemas.openxmlformats.org/drawingml/2006/picture">
-                <pic:pic>
-                  <pic:nvPicPr>
-                    <pic:cNvPr id="0" name="09-stepfunctions-machine.jpg"/>
-                    <pic:cNvPicPr/>
-                  </pic:nvPicPr>
-                  <pic:blipFill>
-                    <a:blip r:embed="rId32"/>
-                    <a:stretch>
-                      <a:fillRect/>
-                    </a:stretch>
-                  </pic:blipFill>
-                  <pic:spPr>
-                    <a:xfrm>
-                      <a:off x="0" y="0"/>
-                      <a:ext cx="5852160" cy="3375013"/>
-                    </a:xfrm>
-                    <a:prstGeom prst="rect"/>
-                  </pic:spPr>
-                </pic:pic>
-              </a:graphicData>
-            </a:graphic>
-          </wp:inline>
-        </w:drawing>
-      </w:r>
-    </w:p>
-    <w:p>
-      <w:pPr>
-        <w:jc w:val="center"/>
-      </w:pPr>
-      <w:r>
-        <w:rPr>
-          <w:i/>
-          <w:color w:val="5B677D"/>
-          <w:sz w:val="17"/>
-        </w:rPr>
-        <w:t>Figure 24. The state machine and its execution history.</w:t>
+        <w:t>Figure 24. The complete state machine. MidpointDecision and FinalDecision branch on the consultant's {decision, feedback}: revise counts a revision and re-runs the stages, reject ends the run, default carries on.</w:t>
       </w:r>
     </w:p>
     <w:p>
@@ -3076,7 +3200,7 @@
               <a:graphicData uri="http://schemas.openxmlformats.org/drawingml/2006/picture">
                 <pic:pic>
                   <pic:nvPicPr>
-                    <pic:cNvPr id="0" name="10-stepfunctions-definition.jpg"/>
+                    <pic:cNvPr id="0" name="09-stepfunctions-machine.jpg"/>
                     <pic:cNvPicPr/>
                   </pic:nvPicPr>
                   <pic:blipFill>
@@ -3109,7 +3233,59 @@
           <w:color w:val="5B677D"/>
           <w:sz w:val="17"/>
         </w:rPr>
-        <w:t>Figure 25. Definition beside graph. Execution input pins stage_image by digest; approvals carry {decision, feedback}; revision loops are bounded by max_revisions.</w:t>
+        <w:t>Figure 25. The state machine and its execution history.</w:t>
+      </w:r>
+    </w:p>
+    <w:p>
+      <w:pPr>
+        <w:jc w:val="center"/>
+      </w:pPr>
+      <w:r>
+        <w:drawing>
+          <wp:inline xmlns:a="http://schemas.openxmlformats.org/drawingml/2006/main" xmlns:pic="http://schemas.openxmlformats.org/drawingml/2006/picture">
+            <wp:extent cx="5852160" cy="3375013"/>
+            <wp:docPr id="26" name="Picture 26"/>
+            <wp:cNvGraphicFramePr>
+              <a:graphicFrameLocks noChangeAspect="1"/>
+            </wp:cNvGraphicFramePr>
+            <a:graphic>
+              <a:graphicData uri="http://schemas.openxmlformats.org/drawingml/2006/picture">
+                <pic:pic>
+                  <pic:nvPicPr>
+                    <pic:cNvPr id="0" name="10-stepfunctions-definition.jpg"/>
+                    <pic:cNvPicPr/>
+                  </pic:nvPicPr>
+                  <pic:blipFill>
+                    <a:blip r:embed="rId34"/>
+                    <a:stretch>
+                      <a:fillRect/>
+                    </a:stretch>
+                  </pic:blipFill>
+                  <pic:spPr>
+                    <a:xfrm>
+                      <a:off x="0" y="0"/>
+                      <a:ext cx="5852160" cy="3375013"/>
+                    </a:xfrm>
+                    <a:prstGeom prst="rect"/>
+                  </pic:spPr>
+                </pic:pic>
+              </a:graphicData>
+            </a:graphic>
+          </wp:inline>
+        </w:drawing>
+      </w:r>
+    </w:p>
+    <w:p>
+      <w:pPr>
+        <w:jc w:val="center"/>
+      </w:pPr>
+      <w:r>
+        <w:rPr>
+          <w:i/>
+          <w:color w:val="5B677D"/>
+          <w:sz w:val="17"/>
+        </w:rPr>
+        <w:t>Figure 26. Definition beside graph. Execution input pins stage_image by digest; approvals carry {decision, feedback}; revision loops are bounded by max_revisions.</w:t>
       </w:r>
     </w:p>
     <w:p>

</xml_diff>